<commit_message>
fix: default body text to left alignment and correct quick paste TOC
</commit_message>
<xml_diff>
--- a/src-tauri/resources/templates/default-report/reference.docx
+++ b/src-tauri/resources/templates/default-report/reference.docx
@@ -503,7 +503,7 @@
     <w:qFormat/>
     <w:pPr>
       <w:spacing w:before="0" w:after="120" w:line="420" w:lineRule="auto"/>
-      <w:jc w:val="both"/>
+      <w:jc w:val="left"/>
       <w:ind w:firstLine="480"/>
     </w:pPr>
     <w:rPr>
@@ -522,7 +522,7 @@
     <w:qFormat/>
     <w:pPr>
       <w:spacing w:before="0" w:after="120" w:line="420" w:lineRule="auto"/>
-      <w:jc w:val="both"/>
+      <w:jc w:val="left"/>
       <w:ind w:firstLine="480"/>
     </w:pPr>
     <w:rPr>

</xml_diff>

<commit_message>
fix: default body text to left alignment and correct quick paste TOC (#4)
</commit_message>
<xml_diff>
--- a/src-tauri/resources/templates/default-report/reference.docx
+++ b/src-tauri/resources/templates/default-report/reference.docx
@@ -503,7 +503,7 @@
     <w:qFormat/>
     <w:pPr>
       <w:spacing w:before="0" w:after="120" w:line="420" w:lineRule="auto"/>
-      <w:jc w:val="both"/>
+      <w:jc w:val="left"/>
       <w:ind w:firstLine="480"/>
     </w:pPr>
     <w:rPr>
@@ -522,7 +522,7 @@
     <w:qFormat/>
     <w:pPr>
       <w:spacing w:before="0" w:after="120" w:line="420" w:lineRule="auto"/>
-      <w:jc w:val="both"/>
+      <w:jc w:val="left"/>
       <w:ind w:firstLine="480"/>
     </w:pPr>
     <w:rPr>

</xml_diff>

<commit_message>
fix: recognize spaced captions and normalize default Word caption formatting
</commit_message>
<xml_diff>
--- a/src-tauri/resources/templates/default-report/reference.docx
+++ b/src-tauri/resources/templates/default-report/reference.docx
@@ -1204,15 +1204,15 @@
     <w:pPr>
       <w:spacing w:before="0" w:after="90" w:line="360" w:lineRule="auto"/>
       <w:jc w:val="center"/>
-      <w:ind/>
-    </w:pPr>
-    <w:rPr>
-      <w:rFonts w:ascii="Times New Roman" w:hAnsi="Times New Roman" w:eastAsia="微软雅黑"/>
+      <w:ind w:left="0" w:right="0" w:firstLine="0" w:firstLineChars="0"/>
+    </w:pPr>
+    <w:rPr>
+      <w:rFonts w:ascii="Times New Roman" w:hAnsi="Times New Roman" w:eastAsia="宋体"/>
       <w:color w:val="334155"/>
-      <w:sz w:val="20"/>
-      <w:szCs w:val="20"/>
-      <w:b w:val="0"/>
-      <w:bCs w:val="0"/>
+      <w:sz w:val="21"/>
+      <w:szCs w:val="21"/>
+      <w:b w:val="1"/>
+      <w:bCs w:val="1"/>
     </w:rPr>
   </w:style>
   <w:style w:type="paragraph" w:customStyle="1" w:styleId="TableCaption">
@@ -1222,33 +1222,33 @@
       <w:keepNext/>
       <w:spacing w:before="0" w:after="90" w:line="360" w:lineRule="auto"/>
       <w:jc w:val="center"/>
-      <w:ind/>
-    </w:pPr>
-    <w:rPr>
-      <w:rFonts w:ascii="Times New Roman" w:hAnsi="Times New Roman" w:eastAsia="微软雅黑"/>
+      <w:ind w:left="0" w:right="0" w:firstLine="0" w:firstLineChars="0"/>
+    </w:pPr>
+    <w:rPr>
+      <w:rFonts w:ascii="Times New Roman" w:hAnsi="Times New Roman" w:eastAsia="宋体"/>
       <w:color w:val="334155"/>
-      <w:sz w:val="20"/>
-      <w:szCs w:val="20"/>
-      <w:b w:val="0"/>
-      <w:bCs w:val="0"/>
+      <w:sz w:val="21"/>
+      <w:szCs w:val="21"/>
+      <w:b w:val="1"/>
+      <w:bCs w:val="1"/>
     </w:rPr>
   </w:style>
   <w:style w:type="paragraph" w:customStyle="1" w:styleId="ImageCaption">
     <w:name w:val="Image Caption"/>
     <w:basedOn w:val="Caption"/>
-    <w:rPr>
-      <w:rFonts w:ascii="Times New Roman" w:hAnsi="Times New Roman" w:eastAsia="微软雅黑"/>
-      <w:color w:val="334155"/>
-      <w:sz w:val="20"/>
-      <w:szCs w:val="20"/>
-      <w:b w:val="0"/>
-      <w:bCs w:val="0"/>
-    </w:rPr>
     <w:pPr>
       <w:spacing w:before="0" w:after="90" w:line="360" w:lineRule="auto"/>
       <w:jc w:val="center"/>
-      <w:ind/>
-    </w:pPr>
+      <w:ind w:left="0" w:right="0" w:firstLine="0" w:firstLineChars="0"/>
+    </w:pPr>
+    <w:rPr>
+      <w:rFonts w:ascii="Times New Roman" w:hAnsi="Times New Roman" w:eastAsia="宋体"/>
+      <w:color w:val="334155"/>
+      <w:sz w:val="21"/>
+      <w:szCs w:val="21"/>
+      <w:b w:val="1"/>
+      <w:bCs w:val="1"/>
+    </w:rPr>
   </w:style>
   <w:style w:type="paragraph" w:customStyle="1" w:styleId="Figure">
     <w:name w:val="Figure"/>

</xml_diff>

<commit_message>
fix: recognize spaced captions and normalize default Word caption formatting (#6)
</commit_message>
<xml_diff>
--- a/src-tauri/resources/templates/default-report/reference.docx
+++ b/src-tauri/resources/templates/default-report/reference.docx
@@ -1204,15 +1204,15 @@
     <w:pPr>
       <w:spacing w:before="0" w:after="90" w:line="360" w:lineRule="auto"/>
       <w:jc w:val="center"/>
-      <w:ind/>
-    </w:pPr>
-    <w:rPr>
-      <w:rFonts w:ascii="Times New Roman" w:hAnsi="Times New Roman" w:eastAsia="微软雅黑"/>
+      <w:ind w:left="0" w:right="0" w:firstLine="0" w:firstLineChars="0"/>
+    </w:pPr>
+    <w:rPr>
+      <w:rFonts w:ascii="Times New Roman" w:hAnsi="Times New Roman" w:eastAsia="宋体"/>
       <w:color w:val="334155"/>
-      <w:sz w:val="20"/>
-      <w:szCs w:val="20"/>
-      <w:b w:val="0"/>
-      <w:bCs w:val="0"/>
+      <w:sz w:val="21"/>
+      <w:szCs w:val="21"/>
+      <w:b w:val="1"/>
+      <w:bCs w:val="1"/>
     </w:rPr>
   </w:style>
   <w:style w:type="paragraph" w:customStyle="1" w:styleId="TableCaption">
@@ -1222,33 +1222,33 @@
       <w:keepNext/>
       <w:spacing w:before="0" w:after="90" w:line="360" w:lineRule="auto"/>
       <w:jc w:val="center"/>
-      <w:ind/>
-    </w:pPr>
-    <w:rPr>
-      <w:rFonts w:ascii="Times New Roman" w:hAnsi="Times New Roman" w:eastAsia="微软雅黑"/>
+      <w:ind w:left="0" w:right="0" w:firstLine="0" w:firstLineChars="0"/>
+    </w:pPr>
+    <w:rPr>
+      <w:rFonts w:ascii="Times New Roman" w:hAnsi="Times New Roman" w:eastAsia="宋体"/>
       <w:color w:val="334155"/>
-      <w:sz w:val="20"/>
-      <w:szCs w:val="20"/>
-      <w:b w:val="0"/>
-      <w:bCs w:val="0"/>
+      <w:sz w:val="21"/>
+      <w:szCs w:val="21"/>
+      <w:b w:val="1"/>
+      <w:bCs w:val="1"/>
     </w:rPr>
   </w:style>
   <w:style w:type="paragraph" w:customStyle="1" w:styleId="ImageCaption">
     <w:name w:val="Image Caption"/>
     <w:basedOn w:val="Caption"/>
-    <w:rPr>
-      <w:rFonts w:ascii="Times New Roman" w:hAnsi="Times New Roman" w:eastAsia="微软雅黑"/>
-      <w:color w:val="334155"/>
-      <w:sz w:val="20"/>
-      <w:szCs w:val="20"/>
-      <w:b w:val="0"/>
-      <w:bCs w:val="0"/>
-    </w:rPr>
     <w:pPr>
       <w:spacing w:before="0" w:after="90" w:line="360" w:lineRule="auto"/>
       <w:jc w:val="center"/>
-      <w:ind/>
-    </w:pPr>
+      <w:ind w:left="0" w:right="0" w:firstLine="0" w:firstLineChars="0"/>
+    </w:pPr>
+    <w:rPr>
+      <w:rFonts w:ascii="Times New Roman" w:hAnsi="Times New Roman" w:eastAsia="宋体"/>
+      <w:color w:val="334155"/>
+      <w:sz w:val="21"/>
+      <w:szCs w:val="21"/>
+      <w:b w:val="1"/>
+      <w:bCs w:val="1"/>
+    </w:rPr>
   </w:style>
   <w:style w:type="paragraph" w:customStyle="1" w:styleId="Figure">
     <w:name w:val="Figure"/>

</xml_diff>